<commit_message>
Weather-proof WhatsApp paging: page-tier alerts (LinkDownProlonged 30m); exclude Docker host shares from disk alerts
Co-Authored-By: Claude Sonnet 5.5 <noreply@anthropic.com>
</commit_message>
<xml_diff>
--- a/docs/ISP Network Observability Platform - Operations Manual.docx
+++ b/docs/ISP Network Observability Platform - Operations Manual.docx
@@ -1139,7 +1139,7 @@
               <w:rPr>
                 <w:sz w:val="20"/>
               </w:rPr>
-              <w:t>LinkDown</w:t>
+              <w:t>LinkDown / LinkDownProlonged</w:t>
             </w:r>
           </w:p>
         </w:tc>
@@ -1153,7 +1153,7 @@
               <w:rPr>
                 <w:sz w:val="20"/>
               </w:rPr>
-              <w:t>A PTP link is unreachable.</w:t>
+              <w:t>A PTP link is unreachable (Telegram at 5 min; WhatsApp page only at 30 min).</w:t>
             </w:r>
           </w:p>
         </w:tc>
@@ -1631,10 +1631,25 @@
         <w:rPr>
           <w:b/>
         </w:rPr>
-        <w:t xml:space="preserve">Critical only, customer-facing. </w:t>
+        <w:t xml:space="preserve">Phone-worthy criticals only. </w:t>
       </w:r>
       <w:r>
-        <w:t>Warnings, resolved notices and all monitoring-server alerts (server down, network lost, exporter down) stay on Telegram.</w:t>
+        <w:t>Rules labelled page="true" (link down 30+ minutes, core router down, sector down, subscriber mass outage). Warnings, resolved notices, ordinary criticals and all monitoring-server alerts stay on Telegram.</w:t>
+      </w:r>
+    </w:p>
+    <w:p>
+      <w:pPr>
+        <w:pStyle w:val="ListBullet"/>
+        <w:spacing w:after="40"/>
+      </w:pPr>
+      <w:r>
+        <w:rPr>
+          <w:b/>
+        </w:rPr>
+        <w:t xml:space="preserve">Weather-proof. </w:t>
+      </w:r>
+      <w:r>
+        <w:t>A link down for 5 minutes alerts Telegram (LinkDown). WhatsApp fires only if it is still down after 30 minutes (LinkDownProlonged), so a 20-minute weather fade never wakes anyone. Tune the 30m in prometheus/rules/link-alerts.yml.</w:t>
       </w:r>
     </w:p>
     <w:p>

</xml_diff>

<commit_message>
Go-live: checklist, transfer guide, refreshed manual and deck, image v1.3 label
Co-Authored-By: Claude Sonnet 5.5 <noreply@anthropic.com>
</commit_message>
<xml_diff>
--- a/docs/ISP Network Observability Platform - Operations Manual.docx
+++ b/docs/ISP Network Observability Platform - Operations Manual.docx
@@ -168,6 +168,15 @@
       </w:pPr>
       <w:r>
         <w:t>9. Command cheat sheet</w:t>
+      </w:r>
+    </w:p>
+    <w:p>
+      <w:pPr>
+        <w:pStyle w:val="ListParagraph"/>
+        <w:spacing w:after="40"/>
+      </w:pPr>
+      <w:r>
+        <w:t>10. Go-live checklist</w:t>
       </w:r>
     </w:p>
     <w:p>
@@ -2812,6 +2821,26 @@
         <w:pStyle w:val="Heading2"/>
       </w:pPr>
       <w:r>
+        <w:t>Move to another computer</w:t>
+      </w:r>
+    </w:p>
+    <w:p>
+      <w:pPr>
+        <w:spacing w:after="120"/>
+      </w:pPr>
+      <w:r>
+        <w:rPr>
+          <w:b w:val="0"/>
+          <w:i w:val="0"/>
+        </w:rPr>
+        <w:t>Do not copy the whole folder (it holds a machine-specific Python environment and local state). Use git for the configuration, and copy secrets/, .env and routeros_exporter/config.yml separately over an encrypted channel. Metric history is optional and lives in the prometheus_data Docker volume. Stop the old stack first so two machines never send alerts. Full steps: docs/INSTALL.md, 'Moving an existing installation'.</w:t>
+      </w:r>
+    </w:p>
+    <w:p>
+      <w:pPr>
+        <w:pStyle w:val="Heading2"/>
+      </w:pPr>
+      <w:r>
         <w:t>Recover a dead server</w:t>
       </w:r>
     </w:p>
@@ -3186,6 +3215,80 @@
       <w:pPr>
         <w:spacing w:after="40"/>
       </w:pPr>
+    </w:p>
+    <w:p>
+      <w:pPr>
+        <w:pStyle w:val="Heading1"/>
+      </w:pPr>
+      <w:r>
+        <w:t>10. Go-live checklist</w:t>
+      </w:r>
+    </w:p>
+    <w:p>
+      <w:pPr>
+        <w:spacing w:after="120"/>
+      </w:pPr>
+      <w:r>
+        <w:rPr>
+          <w:b w:val="0"/>
+          <w:i w:val="0"/>
+        </w:rPr>
+        <w:t>Before production cut-over, work through docs/GO-LIVE.md. In short:</w:t>
+      </w:r>
+    </w:p>
+    <w:p>
+      <w:pPr>
+        <w:pStyle w:val="ListBullet"/>
+        <w:spacing w:after="40"/>
+      </w:pPr>
+      <w:r>
+        <w:t>Server on the management network only, firewalled, Docker enabled at boot.</w:t>
+      </w:r>
+    </w:p>
+    <w:p>
+      <w:pPr>
+        <w:pStyle w:val="ListBullet"/>
+        <w:spacing w:after="40"/>
+      </w:pPr>
+      <w:r>
+        <w:t>Replace every lab value: routers, sectors, links, vantage-points, topology, SNMP communities, RouterOS read-only users.</w:t>
+      </w:r>
+    </w:p>
+    <w:p>
+      <w:pPr>
+        <w:pStyle w:val="ListBullet"/>
+        <w:spacing w:after="40"/>
+      </w:pPr>
+      <w:r>
+        <w:t>Strong Grafana password; production Telegram bot token and the production group chat_id in alertmanager.yml.</w:t>
+      </w:r>
+    </w:p>
+    <w:p>
+      <w:pPr>
+        <w:pStyle w:val="ListBullet"/>
+        <w:spacing w:after="40"/>
+      </w:pPr>
+      <w:r>
+        <w:t>WhatsApp: production number, billing, System User token, approved template, caps sized to budget; stay in dry-run for a week, then live.</w:t>
+      </w:r>
+    </w:p>
+    <w:p>
+      <w:pPr>
+        <w:pStyle w:val="ListBullet"/>
+        <w:spacing w:after="40"/>
+      </w:pPr>
+      <w:r>
+        <w:t>Validate (promtool tests, docker compose config), confirm all Prometheus targets are UP, send one test alert.</w:t>
+      </w:r>
+    </w:p>
+    <w:p>
+      <w:pPr>
+        <w:pStyle w:val="ListBullet"/>
+        <w:spacing w:after="40"/>
+      </w:pPr>
+      <w:r>
+        <w:t>Back up secrets and push the configuration to the git remote; assign a named owner.</w:t>
+      </w:r>
     </w:p>
     <w:p>
       <w:pPr>

</xml_diff>

<commit_message>
Docs: POP-router placement notes; refreshed manuals
Server plugs straight into its POP router: management-only port/VLAN,
sector/POP routes spelled out in GO-LIVE, matching SECURITY control.

Co-Authored-By: Claude Opus 5.5 <noreply@anthropic.com>
</commit_message>
<xml_diff>
--- a/docs/ISP Network Observability Platform - Operations Manual.docx
+++ b/docs/ISP Network Observability Platform - Operations Manual.docx
@@ -3047,7 +3047,7 @@
         <w:spacing w:after="80"/>
       </w:pPr>
       <w:r>
-        <w:t xml:space="preserve">Sectors (bridged L2, management IP in the POP's /25) are reachable only via routes on the sector and the POP router. Today the POP masquerade rule works around this but hides the server's address. Use a NARROW route on the sector (monitoring subnet only, no default route), SNMPv3, an access list, and a POP rule dropping customer -&gt; management. No subscriber impact. Commands below.</w:t>
+        <w:t xml:space="preserve">The monitoring server plugs directly into the POP router (its default gateway is the POP router), so that POP is one hop away; the POP routers already reach each other over the backhaul links, so every POP router is reachable from the server and no inter-POP routing is needed. Sectors (bridged L2, management IP in the POP's /25) still cannot be pinged from the server until the route between the sector and the POP router exists: the sector needs a return route to the server, the POP router needs a route to the sector range unless that range is already on one of its interfaces. Today the POP masquerade rule works around this but hides the server's address. Use a NARROW route on the sector (monitoring subnet only, no default route), SNMPv3, an access list, and a POP rule dropping customer -&gt; management. No subscriber impact. Commands below.</w:t>
       </w:r>
     </w:p>
     <w:p>
@@ -3222,7 +3222,7 @@
           <w:sz w:val="18"/>
           <w:szCs w:val="18"/>
         </w:rPr>
-        <w:t xml:space="preserve"># on the POP router: route for the sector management range (if not connected)</w:t>
+        <w:t xml:space="preserve"># on the POP router: route for the sector management range (only if that range is not already on one of its interfaces)</w:t>
       </w:r>
     </w:p>
     <w:p>
@@ -3283,6 +3283,36 @@
           <w:szCs w:val="18"/>
         </w:rPr>
         <w:t xml:space="preserve"># then remove the POP masquerade rule used to reach the sectors</w:t>
+      </w:r>
+    </w:p>
+    <w:p>
+      <w:pPr>
+        <w:shd w:fill="F1F5F9" w:color="auto" w:val="clear"/>
+        <w:spacing w:before="0" w:after="0"/>
+        <w:ind w:left="120" w:right="120"/>
+      </w:pPr>
+      <w:r>
+        <w:rPr>
+          <w:rFonts w:ascii="Consolas" w:cs="Consolas" w:eastAsia="Consolas" w:hAnsi="Consolas"/>
+          <w:sz w:val="18"/>
+          <w:szCs w:val="18"/>
+        </w:rPr>
+        <w:t xml:space="preserve"># on the server: only if it has a second NIC or a default gateway other than the POP router (it needs internet for Telegram and the heartbeat)</w:t>
+      </w:r>
+    </w:p>
+    <w:p>
+      <w:pPr>
+        <w:shd w:fill="F1F5F9" w:color="auto" w:val="clear"/>
+        <w:spacing w:before="0" w:after="0"/>
+        <w:ind w:left="120" w:right="120"/>
+      </w:pPr>
+      <w:r>
+        <w:rPr>
+          <w:rFonts w:ascii="Consolas" w:cs="Consolas" w:eastAsia="Consolas" w:hAnsi="Consolas"/>
+          <w:sz w:val="18"/>
+          <w:szCs w:val="18"/>
+        </w:rPr>
+        <w:t xml:space="preserve">sudo ip route add &lt;sector-mgmt-range&gt; via &lt;POP-router-IP&gt;</w:t>
       </w:r>
     </w:p>
     <w:p>
@@ -5763,7 +5793,7 @@
         <w:t xml:space="preserve">Dedicated server.</w:t>
       </w:r>
       <w:r>
-        <w:t xml:space="preserve"> No other services; SSH keys only; OS and Docker updates on a schedule. Management network only, no leg in the customer network (SECURITY.md checklist).</w:t>
+        <w:t xml:space="preserve"> No other services; SSH keys only; OS and Docker updates on a schedule. Management network only, no leg in the customer network (SECURITY.md checklist). The server plugs directly into the POP router: use a management-only port or VLAN there, never the customer bridge.</w:t>
       </w:r>
     </w:p>
     <w:p>
@@ -6688,7 +6718,7 @@
           </w:tcPr>
           <w:p>
             <w:r>
-              <w:t xml:space="preserve">Pending - needs the production gateway IP</w:t>
+              <w:t xml:space="preserve">Pending - the gateway is the POP router the server plugs into; needs its IP</w:t>
             </w:r>
           </w:p>
         </w:tc>
@@ -7754,7 +7784,7 @@
           </w:tcPr>
           <w:p>
             <w:r>
-              <w:t xml:space="preserve">docs/src/build-docx.js</w:t>
+              <w:t xml:space="preserve">.claude/docs-builder/build-docx.js</w:t>
             </w:r>
           </w:p>
         </w:tc>
@@ -7771,7 +7801,7 @@
           </w:tcPr>
           <w:p>
             <w:r>
-              <w:t xml:space="preserve">Source of this manual and the Management Overview: </w:t>
+              <w:t xml:space="preserve">Source of this manual and the Management Overview (untracked, kept outside the repository): </w:t>
             </w:r>
             <w:r>
               <w:rPr>
@@ -7783,7 +7813,7 @@
               <w:t xml:space="preserve">npm run build</w:t>
             </w:r>
             <w:r>
-              <w:t xml:space="preserve">.</w:t>
+              <w:t xml:space="preserve"> in that folder.</w:t>
             </w:r>
           </w:p>
         </w:tc>

</xml_diff>

<commit_message>
Docs: step-by-step production install with Ansible; manual updated
docs/ANSIBLE.md now walks a first production install end to end (server
prep incl. time sync and passwordless sudo, laptop setup, vault, deploy,
checks) with a table of every deploy error and its fix, and lists the
outbound hosts the install needs. The Operations Manual gains an
'Install the production server' section and describes releases,
upgrades, moves, recovery and the cheat sheet in terms of
scripts/deploy.sh (manual commands kept for manual installs).
DEPLOYED_VERSION now records the branch name instead of HEAD.

Co-Authored-By: Claude Opus 5.5 <noreply@anthropic.com>
</commit_message>
<xml_diff>
--- a/docs/ISP Network Observability Platform - Operations Manual.docx
+++ b/docs/ISP Network Observability Platform - Operations Manual.docx
@@ -117,7 +117,7 @@
           <w:sz w:val="22"/>
           <w:szCs w:val="22"/>
         </w:rPr>
-        <w:t xml:space="preserve"> folder: ARCHITECTURE, INSTALL, SETUP-INPUTS, GO-LIVE, SECURITY, snmpv3, deadman, whatsapp, server-monitoring, failure-drills.</w:t>
+        <w:t xml:space="preserve"> folder: ANSIBLE (install and releases), ARCHITECTURE, INSTALL, SETUP-INPUTS, GO-LIVE, SECURITY, snmpv3, deadman, whatsapp, server-monitoring, failure-drills.</w:t>
       </w:r>
     </w:p>
     <w:p>
@@ -628,7 +628,19 @@
         <w:t xml:space="preserve">secrets/</w:t>
       </w:r>
       <w:r>
-        <w:t xml:space="preserve"> folder.</w:t>
+        <w:t xml:space="preserve"> folder on the server; with the Ansible deploy they are written there from the encrypted </w:t>
+      </w:r>
+      <w:r>
+        <w:rPr>
+          <w:rFonts w:ascii="Consolas" w:cs="Consolas" w:eastAsia="Consolas" w:hAnsi="Consolas"/>
+          <w:color w:val="1F3A6B"/>
+          <w:sz w:val="19"/>
+          <w:szCs w:val="19"/>
+        </w:rPr>
+        <w:t xml:space="preserve">ansible/secrets.yml</w:t>
+      </w:r>
+      <w:r>
+        <w:t xml:space="preserve">.</w:t>
       </w:r>
     </w:p>
     <w:p>
@@ -2870,7 +2882,99 @@
         <w:spacing w:after="120"/>
       </w:pPr>
       <w:r>
-        <w:t xml:space="preserve">After editing any file below, validate before applying (section 9).</w:t>
+        <w:t xml:space="preserve">How a change reaches the production server: edit on a branch, merge to main, then run </w:t>
+      </w:r>
+      <w:r>
+        <w:rPr>
+          <w:rFonts w:ascii="Consolas" w:cs="Consolas" w:eastAsia="Consolas" w:hAnsi="Consolas"/>
+          <w:color w:val="1F3A6B"/>
+          <w:sz w:val="19"/>
+          <w:szCs w:val="19"/>
+        </w:rPr>
+        <w:t xml:space="preserve">scripts/deploy.sh</w:t>
+      </w:r>
+      <w:r>
+        <w:t xml:space="preserve"> from the laptop (docs/ANSIBLE.md). It checks everything first, then reloads or restarts only what changed; </w:t>
+      </w:r>
+      <w:r>
+        <w:rPr>
+          <w:rFonts w:ascii="Consolas" w:cs="Consolas" w:eastAsia="Consolas" w:hAnsi="Consolas"/>
+          <w:color w:val="1F3A6B"/>
+          <w:sz w:val="19"/>
+          <w:szCs w:val="19"/>
+        </w:rPr>
+        <w:t xml:space="preserve">scripts/deploy.sh --check</w:t>
+      </w:r>
+      <w:r>
+        <w:t xml:space="preserve"> previews it. Secrets (</w:t>
+      </w:r>
+      <w:r>
+        <w:rPr>
+          <w:rFonts w:ascii="Consolas" w:cs="Consolas" w:eastAsia="Consolas" w:hAnsi="Consolas"/>
+          <w:color w:val="1F3A6B"/>
+          <w:sz w:val="19"/>
+          <w:szCs w:val="19"/>
+        </w:rPr>
+        <w:t xml:space="preserve">secrets/...</w:t>
+      </w:r>
+      <w:r>
+        <w:t xml:space="preserve">, </w:t>
+      </w:r>
+      <w:r>
+        <w:rPr>
+          <w:rFonts w:ascii="Consolas" w:cs="Consolas" w:eastAsia="Consolas" w:hAnsi="Consolas"/>
+          <w:color w:val="1F3A6B"/>
+          <w:sz w:val="19"/>
+          <w:szCs w:val="19"/>
+        </w:rPr>
+        <w:t xml:space="preserve">.env</w:t>
+      </w:r>
+      <w:r>
+        <w:t xml:space="preserve">) live in the encrypted </w:t>
+      </w:r>
+      <w:r>
+        <w:rPr>
+          <w:rFonts w:ascii="Consolas" w:cs="Consolas" w:eastAsia="Consolas" w:hAnsi="Consolas"/>
+          <w:color w:val="1F3A6B"/>
+          <w:sz w:val="19"/>
+          <w:szCs w:val="19"/>
+        </w:rPr>
+        <w:t xml:space="preserve">ansible/secrets.yml</w:t>
+      </w:r>
+      <w:r>
+        <w:t xml:space="preserve">: change them with </w:t>
+      </w:r>
+      <w:r>
+        <w:rPr>
+          <w:rFonts w:ascii="Consolas" w:cs="Consolas" w:eastAsia="Consolas" w:hAnsi="Consolas"/>
+          <w:color w:val="1F3A6B"/>
+          <w:sz w:val="19"/>
+          <w:szCs w:val="19"/>
+        </w:rPr>
+        <w:t xml:space="preserve">scripts/edit-secrets.sh</w:t>
+      </w:r>
+      <w:r>
+        <w:t xml:space="preserve">, then deploy.</w:t>
+      </w:r>
+    </w:p>
+    <w:p>
+      <w:pPr>
+        <w:spacing w:after="120"/>
+      </w:pPr>
+      <w:r>
+        <w:t xml:space="preserve">The </w:t>
+      </w:r>
+      <w:r>
+        <w:rPr>
+          <w:rFonts w:ascii="Consolas" w:cs="Consolas" w:eastAsia="Consolas" w:hAnsi="Consolas"/>
+          <w:color w:val="1F3A6B"/>
+          <w:sz w:val="19"/>
+          <w:szCs w:val="19"/>
+        </w:rPr>
+        <w:t xml:space="preserve">docker compose restart ...</w:t>
+      </w:r>
+      <w:r>
+        <w:t xml:space="preserve"> steps below are what the deploy does for you; run them by hand only on a manual install, after validating (section 9).</w:t>
       </w:r>
     </w:p>
     <w:p>
@@ -5108,7 +5212,7 @@
                 <w:sz w:val="19"/>
                 <w:szCs w:val="19"/>
               </w:rPr>
-              <w:t xml:space="preserve">secrets/</w:t>
+              <w:t xml:space="preserve">ansible/secrets.yml: every secret, the .env settings and firewall ranges (manual install: secrets/, .env, routeros_exporter/config.yml)</w:t>
             </w:r>
             <w:r>
               <w:t xml:space="preserve"> (Grafana, Telegram, RouterOS, WhatsApp, SNMPv3 users, heartbeat URL), </w:t>
@@ -5149,7 +5253,7 @@
           </w:tcPr>
           <w:p>
             <w:r>
-              <w:t xml:space="preserve">Encrypted copy kept apart from the repository.</w:t>
+              <w:t xml:space="preserve">Committed to git encrypted; vault password in the password manager, not only on the laptop. Manual install: encrypted copy kept apart from the repository.</w:t>
             </w:r>
           </w:p>
         </w:tc>
@@ -5352,6 +5456,168 @@
         <w:pStyle w:val="Heading2"/>
       </w:pPr>
       <w:r>
+        <w:t xml:space="preserve">Install the production server</w:t>
+      </w:r>
+    </w:p>
+    <w:p>
+      <w:pPr>
+        <w:spacing w:after="120"/>
+      </w:pPr>
+      <w:r>
+        <w:t xml:space="preserve">One command from the laptop installs everything. Step by step, with a table of every error and its fix: docs/ANSIBLE.md, "First production install".</w:t>
+      </w:r>
+    </w:p>
+    <w:p>
+      <w:pPr>
+        <w:pStyle w:val="ListParagraph"/>
+        <w:numPr>
+          <w:ilvl w:val="0"/>
+          <w:numId w:val="7"/>
+        </w:numPr>
+        <w:spacing w:after="80"/>
+      </w:pPr>
+      <w:r>
+        <w:t xml:space="preserve">Server: Ubuntu Server 24.04 LTS with a fixed management IP and OpenSSH; time sync on (</w:t>
+      </w:r>
+      <w:r>
+        <w:rPr>
+          <w:rFonts w:ascii="Consolas" w:cs="Consolas" w:eastAsia="Consolas" w:hAnsi="Consolas"/>
+          <w:color w:val="1F3A6B"/>
+          <w:sz w:val="19"/>
+          <w:szCs w:val="19"/>
+        </w:rPr>
+        <w:t xml:space="preserve">sudo timedatectl set-ntp true</w:t>
+      </w:r>
+      <w:r>
+        <w:t xml:space="preserve">); the admin user allowed passwordless sudo. Nothing else by hand. It needs outbound HTTPS for the install (Ubuntu, Docker, PyPI, grafana.com).</w:t>
+      </w:r>
+    </w:p>
+    <w:p>
+      <w:pPr>
+        <w:pStyle w:val="ListParagraph"/>
+        <w:numPr>
+          <w:ilvl w:val="0"/>
+          <w:numId w:val="7"/>
+        </w:numPr>
+        <w:spacing w:after="80"/>
+      </w:pPr>
+      <w:r>
+        <w:t xml:space="preserve">Laptop: </w:t>
+      </w:r>
+      <w:r>
+        <w:rPr>
+          <w:rFonts w:ascii="Consolas" w:cs="Consolas" w:eastAsia="Consolas" w:hAnsi="Consolas"/>
+          <w:color w:val="1F3A6B"/>
+          <w:sz w:val="19"/>
+          <w:szCs w:val="19"/>
+        </w:rPr>
+        <w:t xml:space="preserve">brew install ansible</w:t>
+      </w:r>
+      <w:r>
+        <w:t xml:space="preserve">; </w:t>
+      </w:r>
+      <w:r>
+        <w:rPr>
+          <w:rFonts w:ascii="Consolas" w:cs="Consolas" w:eastAsia="Consolas" w:hAnsi="Consolas"/>
+          <w:color w:val="1F3A6B"/>
+          <w:sz w:val="19"/>
+          <w:szCs w:val="19"/>
+        </w:rPr>
+        <w:t xml:space="preserve">ssh-copy-id</w:t>
+      </w:r>
+      <w:r>
+        <w:t xml:space="preserve"> to the server; </w:t>
+      </w:r>
+      <w:r>
+        <w:rPr>
+          <w:rFonts w:ascii="Consolas" w:cs="Consolas" w:eastAsia="Consolas" w:hAnsi="Consolas"/>
+          <w:color w:val="1F3A6B"/>
+          <w:sz w:val="19"/>
+          <w:szCs w:val="19"/>
+        </w:rPr>
+        <w:t xml:space="preserve">ansible/inventory.ini</w:t>
+      </w:r>
+      <w:r>
+        <w:t xml:space="preserve"> with its address; the vault password in the macOS Keychain.</w:t>
+      </w:r>
+    </w:p>
+    <w:p>
+      <w:pPr>
+        <w:pStyle w:val="ListParagraph"/>
+        <w:numPr>
+          <w:ilvl w:val="0"/>
+          <w:numId w:val="7"/>
+        </w:numPr>
+        <w:spacing w:after="80"/>
+      </w:pPr>
+      <w:r>
+        <w:t xml:space="preserve">Site data: </w:t>
+      </w:r>
+      <w:r>
+        <w:rPr>
+          <w:rFonts w:ascii="Consolas" w:cs="Consolas" w:eastAsia="Consolas" w:hAnsi="Consolas"/>
+          <w:color w:val="1F3A6B"/>
+          <w:sz w:val="19"/>
+          <w:szCs w:val="19"/>
+        </w:rPr>
+        <w:t xml:space="preserve">scripts/edit-secrets.sh</w:t>
+      </w:r>
+      <w:r>
+        <w:t xml:space="preserve"> (passwords, tokens, router logins, SNMPv3 users, firewall ranges) and the target files; commit, review, merge to main.</w:t>
+      </w:r>
+    </w:p>
+    <w:p>
+      <w:pPr>
+        <w:pStyle w:val="ListParagraph"/>
+        <w:numPr>
+          <w:ilvl w:val="0"/>
+          <w:numId w:val="7"/>
+        </w:numPr>
+        <w:spacing w:after="80"/>
+      </w:pPr>
+      <w:r>
+        <w:rPr>
+          <w:rFonts w:ascii="Consolas" w:cs="Consolas" w:eastAsia="Consolas" w:hAnsi="Consolas"/>
+          <w:color w:val="1F3A6B"/>
+          <w:sz w:val="19"/>
+          <w:szCs w:val="19"/>
+        </w:rPr>
+        <w:t xml:space="preserve">scripts/deploy.sh</w:t>
+      </w:r>
+      <w:r>
+        <w:t xml:space="preserve">. The first run takes 10-40 minutes (about 1.5 GB of downloads, retried if the link drops; Grafana's first start alone takes up to 5 minutes). It ends with a summary and a </w:t>
+      </w:r>
+      <w:r>
+        <w:rPr>
+          <w:rFonts w:ascii="Consolas" w:cs="Consolas" w:eastAsia="Consolas" w:hAnsi="Consolas"/>
+          <w:color w:val="1F3A6B"/>
+          <w:sz w:val="19"/>
+          <w:szCs w:val="19"/>
+        </w:rPr>
+        <w:t xml:space="preserve">deploy-...</w:t>
+      </w:r>
+      <w:r>
+        <w:t xml:space="preserve"> tag; push the tag.</w:t>
+      </w:r>
+    </w:p>
+    <w:p>
+      <w:pPr>
+        <w:pStyle w:val="ListParagraph"/>
+        <w:numPr>
+          <w:ilvl w:val="0"/>
+          <w:numId w:val="7"/>
+        </w:numPr>
+        <w:spacing w:after="80"/>
+      </w:pPr>
+      <w:r>
+        <w:t xml:space="preserve">Check Grafana and /targets, reboot once to confirm everything returns on its own, then the go-live checklist (section 10).</w:t>
+      </w:r>
+    </w:p>
+    <w:p>
+      <w:pPr>
+        <w:pStyle w:val="Heading2"/>
+      </w:pPr>
+      <w:r>
         <w:t xml:space="preserve">Upgrade</w:t>
       </w:r>
     </w:p>
@@ -5367,7 +5633,7 @@
           <w:sz w:val="18"/>
           <w:szCs w:val="18"/>
         </w:rPr>
-        <w:t xml:space="preserve">git pull</w:t>
+        <w:t xml:space="preserve"># Ansible install (from the laptop, on main)</w:t>
       </w:r>
     </w:p>
     <w:p>
@@ -5382,7 +5648,7 @@
           <w:sz w:val="18"/>
           <w:szCs w:val="18"/>
         </w:rPr>
-        <w:t xml:space="preserve">docker compose config -q</w:t>
+        <w:t xml:space="preserve">scripts/deploy.sh --check                # preview</w:t>
       </w:r>
     </w:p>
     <w:p>
@@ -5397,7 +5663,67 @@
           <w:sz w:val="18"/>
           <w:szCs w:val="18"/>
         </w:rPr>
-        <w:t xml:space="preserve">docker compose up -d --build</w:t>
+        <w:t xml:space="preserve">scripts/deploy.sh                        # release</w:t>
+      </w:r>
+    </w:p>
+    <w:p>
+      <w:pPr>
+        <w:shd w:fill="F1F5F9" w:color="auto" w:val="clear"/>
+        <w:spacing w:before="0" w:after="0"/>
+        <w:ind w:left="120" w:right="120"/>
+      </w:pPr>
+      <w:r>
+        <w:rPr>
+          <w:rFonts w:ascii="Consolas" w:cs="Consolas" w:eastAsia="Consolas" w:hAnsi="Consolas"/>
+          <w:sz w:val="18"/>
+          <w:szCs w:val="18"/>
+        </w:rPr>
+        <w:t xml:space="preserve">scripts/deploy.sh deploy-2026-10-26-0915 # roll back to an earlier tag</w:t>
+      </w:r>
+    </w:p>
+    <w:p>
+      <w:pPr>
+        <w:shd w:fill="F1F5F9" w:color="auto" w:val="clear"/>
+        <w:spacing w:before="0" w:after="0"/>
+        <w:ind w:left="120" w:right="120"/>
+      </w:pPr>
+      <w:r>
+        <w:rPr>
+          <w:rFonts w:ascii="Consolas" w:cs="Consolas" w:eastAsia="Consolas" w:hAnsi="Consolas"/>
+          <w:sz w:val="18"/>
+          <w:szCs w:val="18"/>
+        </w:rPr>
+        <w:t xml:space="preserve"> </w:t>
+      </w:r>
+    </w:p>
+    <w:p>
+      <w:pPr>
+        <w:shd w:fill="F1F5F9" w:color="auto" w:val="clear"/>
+        <w:spacing w:before="0" w:after="0"/>
+        <w:ind w:left="120" w:right="120"/>
+      </w:pPr>
+      <w:r>
+        <w:rPr>
+          <w:rFonts w:ascii="Consolas" w:cs="Consolas" w:eastAsia="Consolas" w:hAnsi="Consolas"/>
+          <w:sz w:val="18"/>
+          <w:szCs w:val="18"/>
+        </w:rPr>
+        <w:t xml:space="preserve"># manual install (on the server)</w:t>
+      </w:r>
+    </w:p>
+    <w:p>
+      <w:pPr>
+        <w:shd w:fill="F1F5F9" w:color="auto" w:val="clear"/>
+        <w:spacing w:before="0" w:after="0"/>
+        <w:ind w:left="120" w:right="120"/>
+      </w:pPr>
+      <w:r>
+        <w:rPr>
+          <w:rFonts w:ascii="Consolas" w:cs="Consolas" w:eastAsia="Consolas" w:hAnsi="Consolas"/>
+          <w:sz w:val="18"/>
+          <w:szCs w:val="18"/>
+        </w:rPr>
+        <w:t xml:space="preserve">git pull &amp;&amp; docker compose config -q &amp;&amp; docker compose up -d --build</w:t>
       </w:r>
     </w:p>
     <w:p>
@@ -5460,7 +5786,7 @@
         <w:spacing w:after="120"/>
       </w:pPr>
       <w:r>
-        <w:t xml:space="preserve">Use git for configuration; copy the secrets separately over an encrypted channel; restore secret permissions (</w:t>
+        <w:t xml:space="preserve">Ansible install: prepare the new machine as in "Install the production server" step 1, point </w:t>
       </w:r>
       <w:r>
         <w:rPr>
@@ -5469,10 +5795,62 @@
           <w:sz w:val="19"/>
           <w:szCs w:val="19"/>
         </w:rPr>
+        <w:t xml:space="preserve">ansible/inventory.ini</w:t>
+      </w:r>
+      <w:r>
+        <w:t xml:space="preserve"> at it and run </w:t>
+      </w:r>
+      <w:r>
+        <w:rPr>
+          <w:rFonts w:ascii="Consolas" w:cs="Consolas" w:eastAsia="Consolas" w:hAnsi="Consolas"/>
+          <w:color w:val="1F3A6B"/>
+          <w:sz w:val="19"/>
+          <w:szCs w:val="19"/>
+        </w:rPr>
+        <w:t xml:space="preserve">scripts/deploy.sh</w:t>
+      </w:r>
+      <w:r>
+        <w:t xml:space="preserve">; configuration and secrets come from git and the vault. Keep the Compose project name (</w:t>
+      </w:r>
+      <w:r>
+        <w:rPr>
+          <w:rFonts w:ascii="Consolas" w:cs="Consolas" w:eastAsia="Consolas" w:hAnsi="Consolas"/>
+          <w:color w:val="1F3A6B"/>
+          <w:sz w:val="19"/>
+          <w:szCs w:val="19"/>
+        </w:rPr>
+        <w:t xml:space="preserve">compose_project</w:t>
+      </w:r>
+      <w:r>
+        <w:t xml:space="preserve">) when taking over an existing manual install, so its volumes and history are reused (docs/ANSIBLE.md).</w:t>
+      </w:r>
+    </w:p>
+    <w:p>
+      <w:pPr>
+        <w:spacing w:after="120"/>
+      </w:pPr>
+      <w:r>
+        <w:t xml:space="preserve">Manual install: use git for configuration; copy the secrets separately over an encrypted channel; restore secret permissions (</w:t>
+      </w:r>
+      <w:r>
+        <w:rPr>
+          <w:rFonts w:ascii="Consolas" w:cs="Consolas" w:eastAsia="Consolas" w:hAnsi="Consolas"/>
+          <w:color w:val="1F3A6B"/>
+          <w:sz w:val="19"/>
+          <w:szCs w:val="19"/>
+        </w:rPr>
         <w:t xml:space="preserve">chmod 700 secrets &amp;&amp; chmod 644 secrets/*</w:t>
       </w:r>
       <w:r>
-        <w:t xml:space="preserve">). Stop the old stack first so two machines never alert. Full steps: INSTALL.md, 'Moving an existing installation'.</w:t>
+        <w:t xml:space="preserve">). Full steps: INSTALL.md, 'Moving an existing installation'.</w:t>
+      </w:r>
+    </w:p>
+    <w:p>
+      <w:pPr>
+        <w:spacing w:after="120"/>
+      </w:pPr>
+      <w:r>
+        <w:t xml:space="preserve">Either way, stop the old stack first so two machines never alert.</w:t>
       </w:r>
     </w:p>
     <w:p>
@@ -5493,7 +5871,7 @@
         <w:spacing w:after="80"/>
       </w:pPr>
       <w:r>
-        <w:t xml:space="preserve">Install Docker on the replacement Linux machine (INSTALL.md).</w:t>
+        <w:t xml:space="preserve">Prepare a replacement Ubuntu 24.04 machine as in "Install the production server" step 1 (fixed IP, SSH key, passwordless sudo, time sync).</w:t>
       </w:r>
     </w:p>
     <w:p>
@@ -5506,16 +5884,19 @@
         <w:spacing w:after="80"/>
       </w:pPr>
       <w:r>
+        <w:t xml:space="preserve">Point </w:t>
+      </w:r>
+      <w:r>
         <w:rPr>
           <w:rFonts w:ascii="Consolas" w:cs="Consolas" w:eastAsia="Consolas" w:hAnsi="Consolas"/>
           <w:color w:val="1F3A6B"/>
           <w:sz w:val="19"/>
           <w:szCs w:val="19"/>
         </w:rPr>
-        <w:t xml:space="preserve">git clone</w:t>
-      </w:r>
-      <w:r>
-        <w:t xml:space="preserve"> the repository; restore </w:t>
+        <w:t xml:space="preserve">ansible/inventory.ini</w:t>
+      </w:r>
+      <w:r>
+        <w:t xml:space="preserve"> at it and run </w:t>
       </w:r>
       <w:r>
         <w:rPr>
@@ -5524,10 +5905,10 @@
           <w:sz w:val="19"/>
           <w:szCs w:val="19"/>
         </w:rPr>
-        <w:t xml:space="preserve">secrets/</w:t>
-      </w:r>
-      <w:r>
-        <w:t xml:space="preserve"> and </w:t>
+        <w:t xml:space="preserve">scripts/deploy.sh</w:t>
+      </w:r>
+      <w:r>
+        <w:t xml:space="preserve">: Docker, firewall, secrets and the whole stack come back from git and the vault. (Manual install: Docker per INSTALL.md, </w:t>
       </w:r>
       <w:r>
         <w:rPr>
@@ -5536,10 +5917,10 @@
           <w:sz w:val="19"/>
           <w:szCs w:val="19"/>
         </w:rPr>
-        <w:t xml:space="preserve">.env</w:t>
-      </w:r>
-      <w:r>
-        <w:t xml:space="preserve"> (or run </w:t>
+        <w:t xml:space="preserve">git clone</w:t>
+      </w:r>
+      <w:r>
+        <w:t xml:space="preserve">, restore </w:t>
       </w:r>
       <w:r>
         <w:rPr>
@@ -5548,10 +5929,34 @@
           <w:sz w:val="19"/>
           <w:szCs w:val="19"/>
         </w:rPr>
-        <w:t xml:space="preserve">scripts/init.sh</w:t>
-      </w:r>
-      <w:r>
-        <w:t xml:space="preserve"> and re-enter them per SETUP-INPUTS.md).</w:t>
+        <w:t xml:space="preserve">secrets/</w:t>
+      </w:r>
+      <w:r>
+        <w:t xml:space="preserve"> and </w:t>
+      </w:r>
+      <w:r>
+        <w:rPr>
+          <w:rFonts w:ascii="Consolas" w:cs="Consolas" w:eastAsia="Consolas" w:hAnsi="Consolas"/>
+          <w:color w:val="1F3A6B"/>
+          <w:sz w:val="19"/>
+          <w:szCs w:val="19"/>
+        </w:rPr>
+        <w:t xml:space="preserve">.env</w:t>
+      </w:r>
+      <w:r>
+        <w:t xml:space="preserve">, </w:t>
+      </w:r>
+      <w:r>
+        <w:rPr>
+          <w:rFonts w:ascii="Consolas" w:cs="Consolas" w:eastAsia="Consolas" w:hAnsi="Consolas"/>
+          <w:color w:val="1F3A6B"/>
+          <w:sz w:val="19"/>
+          <w:szCs w:val="19"/>
+        </w:rPr>
+        <w:t xml:space="preserve">docker compose up -d --build</w:t>
+      </w:r>
+      <w:r>
+        <w:t xml:space="preserve">.)</w:t>
       </w:r>
     </w:p>
     <w:p>
@@ -5564,16 +5969,7 @@
         <w:spacing w:after="80"/>
       </w:pPr>
       <w:r>
-        <w:rPr>
-          <w:rFonts w:ascii="Consolas" w:cs="Consolas" w:eastAsia="Consolas" w:hAnsi="Consolas"/>
-          <w:color w:val="1F3A6B"/>
-          <w:sz w:val="19"/>
-          <w:szCs w:val="19"/>
-        </w:rPr>
-        <w:t xml:space="preserve">docker compose up -d --build</w:t>
-      </w:r>
-      <w:r>
-        <w:t xml:space="preserve">. History is lost unless the volume archive is restored; configuration and alerts come back from git. The heartbeat turns green again on its own.</w:t>
+        <w:t xml:space="preserve">History is lost unless the volume archive is restored; configuration and alerts come back from git. The heartbeat turns green again on its own.</w:t>
       </w:r>
     </w:p>
     <w:p>
@@ -5816,7 +6212,7 @@
           <w:sz w:val="18"/>
           <w:szCs w:val="18"/>
         </w:rPr>
-        <w:t xml:space="preserve"># status and logs</w:t>
+        <w:t xml:space="preserve"># release, from the laptop (Ansible install)</w:t>
       </w:r>
     </w:p>
     <w:p>
@@ -5831,7 +6227,7 @@
           <w:sz w:val="18"/>
           <w:szCs w:val="18"/>
         </w:rPr>
-        <w:t xml:space="preserve">docker compose ps</w:t>
+        <w:t xml:space="preserve">scripts/deploy.sh --check                # preview, nothing touched</w:t>
       </w:r>
     </w:p>
     <w:p>
@@ -5846,7 +6242,7 @@
           <w:sz w:val="18"/>
           <w:szCs w:val="18"/>
         </w:rPr>
-        <w:t xml:space="preserve">docker compose logs --tail 100 -f &lt;service&gt;</w:t>
+        <w:t xml:space="preserve">scripts/deploy.sh                        # release main</w:t>
       </w:r>
     </w:p>
     <w:p>
@@ -5861,7 +6257,7 @@
           <w:sz w:val="18"/>
           <w:szCs w:val="18"/>
         </w:rPr>
-        <w:t xml:space="preserve"> </w:t>
+        <w:t xml:space="preserve">scripts/deploy.sh deploy-2026-10-26-0915 # roll back</w:t>
       </w:r>
     </w:p>
     <w:p>
@@ -5876,7 +6272,7 @@
           <w:sz w:val="18"/>
           <w:szCs w:val="18"/>
         </w:rPr>
-        <w:t xml:space="preserve"># validate before applying (no local promtool: run it in Docker)</w:t>
+        <w:t xml:space="preserve">scripts/edit-secrets.sh                  # change a secret, then commit + deploy</w:t>
       </w:r>
     </w:p>
     <w:p>
@@ -5891,7 +6287,7 @@
           <w:sz w:val="18"/>
           <w:szCs w:val="18"/>
         </w:rPr>
-        <w:t xml:space="preserve">docker run --rm -v "$PWD/prometheus:/p" --entrypoint sh prom/prometheus:v3.13.2 \</w:t>
+        <w:t xml:space="preserve">ssh &lt;server&gt; cat /opt/isp-observability/DEPLOYED_VERSION</w:t>
       </w:r>
     </w:p>
     <w:p>
@@ -5906,7 +6302,7 @@
           <w:sz w:val="18"/>
           <w:szCs w:val="18"/>
         </w:rPr>
-        <w:t xml:space="preserve">  -c 'cd /p &amp;&amp; promtool check rules rules/*.yml &amp;&amp; promtool test rules rules/tests/*.yml'</w:t>
+        <w:t xml:space="preserve"> </w:t>
       </w:r>
     </w:p>
     <w:p>
@@ -5921,7 +6317,7 @@
           <w:sz w:val="18"/>
           <w:szCs w:val="18"/>
         </w:rPr>
-        <w:t xml:space="preserve">docker run --rm -v "$PWD/alertmanager:/a" --entrypoint amtool prom/alertmanager:v0.33.1 \</w:t>
+        <w:t xml:space="preserve"># on the server: cd /opt/isp-observability; Ansible installs need sudo docker ...</w:t>
       </w:r>
     </w:p>
     <w:p>
@@ -5936,7 +6332,7 @@
           <w:sz w:val="18"/>
           <w:szCs w:val="18"/>
         </w:rPr>
-        <w:t xml:space="preserve">  check-config /a/alertmanager.yml</w:t>
+        <w:t xml:space="preserve"># status and logs</w:t>
       </w:r>
     </w:p>
     <w:p>
@@ -5951,7 +6347,7 @@
           <w:sz w:val="18"/>
           <w:szCs w:val="18"/>
         </w:rPr>
-        <w:t xml:space="preserve">docker compose config -q</w:t>
+        <w:t xml:space="preserve">docker compose ps</w:t>
       </w:r>
     </w:p>
     <w:p>
@@ -5966,7 +6362,7 @@
           <w:sz w:val="18"/>
           <w:szCs w:val="18"/>
         </w:rPr>
-        <w:t xml:space="preserve"> </w:t>
+        <w:t xml:space="preserve">docker compose logs --tail 100 -f &lt;service&gt;</w:t>
       </w:r>
     </w:p>
     <w:p>
@@ -5981,7 +6377,7 @@
           <w:sz w:val="18"/>
           <w:szCs w:val="18"/>
         </w:rPr>
-        <w:t xml:space="preserve"># apply</w:t>
+        <w:t xml:space="preserve"> </w:t>
       </w:r>
     </w:p>
     <w:p>
@@ -5996,7 +6392,7 @@
           <w:sz w:val="18"/>
           <w:szCs w:val="18"/>
         </w:rPr>
-        <w:t xml:space="preserve">docker compose up -d --build</w:t>
+        <w:t xml:space="preserve"># validate before applying (no local promtool: run it in Docker)</w:t>
       </w:r>
     </w:p>
     <w:p>
@@ -6011,7 +6407,7 @@
           <w:sz w:val="18"/>
           <w:szCs w:val="18"/>
         </w:rPr>
-        <w:t xml:space="preserve">docker compose restart prometheus        # rules / scrape / retention</w:t>
+        <w:t xml:space="preserve">docker run --rm -v "$PWD/prometheus:/p" --entrypoint sh prom/prometheus:v3.13.2 \</w:t>
       </w:r>
     </w:p>
     <w:p>
@@ -6026,7 +6422,7 @@
           <w:sz w:val="18"/>
           <w:szCs w:val="18"/>
         </w:rPr>
-        <w:t xml:space="preserve">docker compose restart alertmanager      # routing, chat id, heartbeat</w:t>
+        <w:t xml:space="preserve">  -c 'cd /p &amp;&amp; promtool check rules rules/*.yml &amp;&amp; promtool test rules rules/tests/*.yml'</w:t>
       </w:r>
     </w:p>
     <w:p>
@@ -6041,7 +6437,7 @@
           <w:sz w:val="18"/>
           <w:szCs w:val="18"/>
         </w:rPr>
-        <w:t xml:space="preserve">docker compose restart snmp-exporter     # snmp.yml or secrets/snmp_auths.yml</w:t>
+        <w:t xml:space="preserve">docker run --rm -v "$PWD/alertmanager:/a" --entrypoint amtool prom/alertmanager:v0.33.1 \</w:t>
       </w:r>
     </w:p>
     <w:p>
@@ -6056,7 +6452,7 @@
           <w:sz w:val="18"/>
           <w:szCs w:val="18"/>
         </w:rPr>
-        <w:t xml:space="preserve">docker compose restart routeros-exporter # its config or credentials</w:t>
+        <w:t xml:space="preserve">  check-config /a/alertmanager.yml</w:t>
       </w:r>
     </w:p>
     <w:p>
@@ -6071,7 +6467,7 @@
           <w:sz w:val="18"/>
           <w:szCs w:val="18"/>
         </w:rPr>
-        <w:t xml:space="preserve"> </w:t>
+        <w:t xml:space="preserve">docker compose config -q</w:t>
       </w:r>
     </w:p>
     <w:p>
@@ -6086,7 +6482,7 @@
           <w:sz w:val="18"/>
           <w:szCs w:val="18"/>
         </w:rPr>
-        <w:t xml:space="preserve"># SNMP test against one device (1 = working)</w:t>
+        <w:t xml:space="preserve"> </w:t>
       </w:r>
     </w:p>
     <w:p>
@@ -6101,7 +6497,7 @@
           <w:sz w:val="18"/>
           <w:szCs w:val="18"/>
         </w:rPr>
-        <w:t xml:space="preserve">curl -s 'http://localhost:9116/snmp?target=&lt;ip&gt;&amp;module=mikrotik&amp;auth=mikrotik_v3' | grep -c '^sysUpTime'</w:t>
+        <w:t xml:space="preserve"># apply by hand (manual install; the deploy does this for you)</w:t>
       </w:r>
     </w:p>
     <w:p>
@@ -6116,7 +6512,7 @@
           <w:sz w:val="18"/>
           <w:szCs w:val="18"/>
         </w:rPr>
-        <w:t xml:space="preserve"> </w:t>
+        <w:t xml:space="preserve">docker compose up -d --build</w:t>
       </w:r>
     </w:p>
     <w:p>
@@ -6131,7 +6527,7 @@
           <w:sz w:val="18"/>
           <w:szCs w:val="18"/>
         </w:rPr>
-        <w:t xml:space="preserve"># heartbeat: send a test failure, then recover</w:t>
+        <w:t xml:space="preserve">docker compose restart prometheus        # rules / scrape / retention</w:t>
       </w:r>
     </w:p>
     <w:p>
@@ -6146,7 +6542,7 @@
           <w:sz w:val="18"/>
           <w:szCs w:val="18"/>
         </w:rPr>
-        <w:t xml:space="preserve">curl -fsS -X POST "$(cat secrets/deadman_url.txt)/fail"</w:t>
+        <w:t xml:space="preserve">docker compose restart alertmanager      # routing, chat id, heartbeat</w:t>
       </w:r>
     </w:p>
     <w:p>
@@ -6161,7 +6557,7 @@
           <w:sz w:val="18"/>
           <w:szCs w:val="18"/>
         </w:rPr>
-        <w:t xml:space="preserve">curl -fsS -X POST "$(cat secrets/deadman_url.txt)"</w:t>
+        <w:t xml:space="preserve">docker compose restart snmp-exporter     # snmp.yml or secrets/snmp_auths.yml</w:t>
       </w:r>
     </w:p>
     <w:p>
@@ -6176,7 +6572,7 @@
           <w:sz w:val="18"/>
           <w:szCs w:val="18"/>
         </w:rPr>
-        <w:t xml:space="preserve"> </w:t>
+        <w:t xml:space="preserve">docker compose restart routeros-exporter # its config or credentials</w:t>
       </w:r>
     </w:p>
     <w:p>
@@ -6191,7 +6587,7 @@
           <w:sz w:val="18"/>
           <w:szCs w:val="18"/>
         </w:rPr>
-        <w:t xml:space="preserve"># Grafana admin password</w:t>
+        <w:t xml:space="preserve"> </w:t>
       </w:r>
     </w:p>
     <w:p>
@@ -6206,7 +6602,7 @@
           <w:sz w:val="18"/>
           <w:szCs w:val="18"/>
         </w:rPr>
-        <w:t xml:space="preserve">docker compose exec grafana grafana cli admin reset-admin-password '&lt;new&gt;'</w:t>
+        <w:t xml:space="preserve"># SNMP test against one device (1 = working)</w:t>
       </w:r>
     </w:p>
     <w:p>
@@ -6221,7 +6617,7 @@
           <w:sz w:val="18"/>
           <w:szCs w:val="18"/>
         </w:rPr>
-        <w:t xml:space="preserve"> </w:t>
+        <w:t xml:space="preserve">curl -s 'http://localhost:9116/snmp?target=&lt;ip&gt;&amp;module=mikrotik&amp;auth=mikrotik_v3' | grep -c '^sysUpTime'</w:t>
       </w:r>
     </w:p>
     <w:p>
@@ -6236,7 +6632,127 @@
           <w:sz w:val="18"/>
           <w:szCs w:val="18"/>
         </w:rPr>
-        <w:t xml:space="preserve"># secret permissions on Linux</w:t>
+        <w:t xml:space="preserve"> </w:t>
+      </w:r>
+    </w:p>
+    <w:p>
+      <w:pPr>
+        <w:shd w:fill="F1F5F9" w:color="auto" w:val="clear"/>
+        <w:spacing w:before="0" w:after="0"/>
+        <w:ind w:left="120" w:right="120"/>
+      </w:pPr>
+      <w:r>
+        <w:rPr>
+          <w:rFonts w:ascii="Consolas" w:cs="Consolas" w:eastAsia="Consolas" w:hAnsi="Consolas"/>
+          <w:sz w:val="18"/>
+          <w:szCs w:val="18"/>
+        </w:rPr>
+        <w:t xml:space="preserve"># heartbeat: send a test failure, then recover</w:t>
+      </w:r>
+    </w:p>
+    <w:p>
+      <w:pPr>
+        <w:shd w:fill="F1F5F9" w:color="auto" w:val="clear"/>
+        <w:spacing w:before="0" w:after="0"/>
+        <w:ind w:left="120" w:right="120"/>
+      </w:pPr>
+      <w:r>
+        <w:rPr>
+          <w:rFonts w:ascii="Consolas" w:cs="Consolas" w:eastAsia="Consolas" w:hAnsi="Consolas"/>
+          <w:sz w:val="18"/>
+          <w:szCs w:val="18"/>
+        </w:rPr>
+        <w:t xml:space="preserve">curl -fsS -X POST "$(cat secrets/deadman_url.txt)/fail"</w:t>
+      </w:r>
+    </w:p>
+    <w:p>
+      <w:pPr>
+        <w:shd w:fill="F1F5F9" w:color="auto" w:val="clear"/>
+        <w:spacing w:before="0" w:after="0"/>
+        <w:ind w:left="120" w:right="120"/>
+      </w:pPr>
+      <w:r>
+        <w:rPr>
+          <w:rFonts w:ascii="Consolas" w:cs="Consolas" w:eastAsia="Consolas" w:hAnsi="Consolas"/>
+          <w:sz w:val="18"/>
+          <w:szCs w:val="18"/>
+        </w:rPr>
+        <w:t xml:space="preserve">curl -fsS -X POST "$(cat secrets/deadman_url.txt)"</w:t>
+      </w:r>
+    </w:p>
+    <w:p>
+      <w:pPr>
+        <w:shd w:fill="F1F5F9" w:color="auto" w:val="clear"/>
+        <w:spacing w:before="0" w:after="0"/>
+        <w:ind w:left="120" w:right="120"/>
+      </w:pPr>
+      <w:r>
+        <w:rPr>
+          <w:rFonts w:ascii="Consolas" w:cs="Consolas" w:eastAsia="Consolas" w:hAnsi="Consolas"/>
+          <w:sz w:val="18"/>
+          <w:szCs w:val="18"/>
+        </w:rPr>
+        <w:t xml:space="preserve"> </w:t>
+      </w:r>
+    </w:p>
+    <w:p>
+      <w:pPr>
+        <w:shd w:fill="F1F5F9" w:color="auto" w:val="clear"/>
+        <w:spacing w:before="0" w:after="0"/>
+        <w:ind w:left="120" w:right="120"/>
+      </w:pPr>
+      <w:r>
+        <w:rPr>
+          <w:rFonts w:ascii="Consolas" w:cs="Consolas" w:eastAsia="Consolas" w:hAnsi="Consolas"/>
+          <w:sz w:val="18"/>
+          <w:szCs w:val="18"/>
+        </w:rPr>
+        <w:t xml:space="preserve"># Grafana admin password (Ansible: change it in the vault and deploy)</w:t>
+      </w:r>
+    </w:p>
+    <w:p>
+      <w:pPr>
+        <w:shd w:fill="F1F5F9" w:color="auto" w:val="clear"/>
+        <w:spacing w:before="0" w:after="0"/>
+        <w:ind w:left="120" w:right="120"/>
+      </w:pPr>
+      <w:r>
+        <w:rPr>
+          <w:rFonts w:ascii="Consolas" w:cs="Consolas" w:eastAsia="Consolas" w:hAnsi="Consolas"/>
+          <w:sz w:val="18"/>
+          <w:szCs w:val="18"/>
+        </w:rPr>
+        <w:t xml:space="preserve">docker compose exec grafana grafana cli admin reset-admin-password '&lt;new&gt;'</w:t>
+      </w:r>
+    </w:p>
+    <w:p>
+      <w:pPr>
+        <w:shd w:fill="F1F5F9" w:color="auto" w:val="clear"/>
+        <w:spacing w:before="0" w:after="0"/>
+        <w:ind w:left="120" w:right="120"/>
+      </w:pPr>
+      <w:r>
+        <w:rPr>
+          <w:rFonts w:ascii="Consolas" w:cs="Consolas" w:eastAsia="Consolas" w:hAnsi="Consolas"/>
+          <w:sz w:val="18"/>
+          <w:szCs w:val="18"/>
+        </w:rPr>
+        <w:t xml:space="preserve"> </w:t>
+      </w:r>
+    </w:p>
+    <w:p>
+      <w:pPr>
+        <w:shd w:fill="F1F5F9" w:color="auto" w:val="clear"/>
+        <w:spacing w:before="0" w:after="0"/>
+        <w:ind w:left="120" w:right="120"/>
+      </w:pPr>
+      <w:r>
+        <w:rPr>
+          <w:rFonts w:ascii="Consolas" w:cs="Consolas" w:eastAsia="Consolas" w:hAnsi="Consolas"/>
+          <w:sz w:val="18"/>
+          <w:szCs w:val="18"/>
+        </w:rPr>
+        <w:t xml:space="preserve"># secret permissions on Linux (manual install; the deploy sets them)</w:t>
       </w:r>
     </w:p>
     <w:p>
@@ -6679,7 +7195,7 @@
           </w:tcPr>
           <w:p>
             <w:r>
-              <w:t xml:space="preserve">Pending - server not installed</w:t>
+              <w:t xml:space="preserve">Pending - scripts/deploy.sh installs Docker and the firewall (tested end to end on the lab server)</w:t>
             </w:r>
           </w:p>
         </w:tc>
@@ -6831,7 +7347,7 @@
           </w:tcPr>
           <w:p>
             <w:r>
-              <w:t xml:space="preserve">Pending - </w:t>
+              <w:t xml:space="preserve">Done by the deploy (scripts/init.sh for a manual install)</w:t>
             </w:r>
             <w:r>
               <w:rPr>
@@ -8834,6 +9350,12 @@
     </w:lvlOverride>
   </w:num>
   <w:num w:numId="6">
+    <w:abstractNumId w:val="3"/>
+    <w:lvlOverride w:ilvl="0">
+      <w:startOverride w:val="1"/>
+    </w:lvlOverride>
+  </w:num>
+  <w:num w:numId="7">
     <w:abstractNumId w:val="3"/>
     <w:lvlOverride w:ilvl="0">
       <w:startOverride w:val="1"/>

</xml_diff>